<commit_message>
Data-request sheets: municipality page extended to 8 items (PDM phasing, projections, GIS files, dwellings per building)
Co-Authored-By: Claude Fable 5 <noreply@anthropic.com>
</commit_message>
<xml_diff>
--- a/W5/03_outputs/reports/Data_Request_Sheets.docx
+++ b/W5/03_outputs/reports/Data_Request_Sheets.docx
@@ -1001,7 +1001,7 @@
           <w:sz w:val="21"/>
           <w:szCs w:val="21"/>
         </w:rPr>
-        <w:t xml:space="preserve">Estudo a rede de ecopontos do concelho com dados de sensores de enchimento. Para ligar a recolha à procura real, peço os cinco elementos abaixo.</w:t>
+        <w:t xml:space="preserve">Estudo a rede de ecopontos do concelho com dados de sensores de enchimento. Para ligar a recolha à procura real, peço os oito elementos abaixo.</w:t>
       </w:r>
     </w:p>
     <w:p>
@@ -1017,7 +1017,7 @@
           <w:sz w:val="21"/>
           <w:szCs w:val="21"/>
         </w:rPr>
-        <w:t xml:space="preserve">I study the municipality's ecoponto network using fill-sensor data. To connect collection with real demand, I ask for the five items below.</w:t>
+        <w:t xml:space="preserve">I study the municipality's ecoponto network using fill-sensor data. To connect collection with real demand, I ask for the eight items below.</w:t>
       </w:r>
     </w:p>
     <w:tbl>
@@ -1429,6 +1429,20 @@
               <w:t xml:space="preserve">Crescimento urbano — áreas de expansão previstas no PDM; novos loteamentos desde 2020.</w:t>
             </w:r>
           </w:p>
+          <w:p>
+            <w:pPr>
+              <w:spacing w:after="40" w:before="0"/>
+            </w:pPr>
+            <w:r>
+              <w:rPr>
+                <w:rFonts w:ascii="Calibri" w:cs="Calibri" w:eastAsia="Calibri" w:hAnsi="Calibri"/>
+                <w:color w:val="1a1a1a"/>
+                <w:sz w:val="21"/>
+                <w:szCs w:val="21"/>
+              </w:rPr>
+              <w:t xml:space="preserve">Programa de execução ou faseamento: ano previsto de ocupação plena de cada área.</w:t>
+            </w:r>
+          </w:p>
         </w:tc>
         <w:tc>
           <w:tcPr>
@@ -1454,6 +1468,20 @@
                 <w:szCs w:val="21"/>
               </w:rPr>
               <w:t xml:space="preserve">Urban growth — expansion areas in the municipal master plan; new developments since 2020.</w:t>
+            </w:r>
+          </w:p>
+          <w:p>
+            <w:pPr>
+              <w:spacing w:after="40" w:before="0"/>
+            </w:pPr>
+            <w:r>
+              <w:rPr>
+                <w:rFonts w:ascii="Calibri" w:cs="Calibri" w:eastAsia="Calibri" w:hAnsi="Calibri"/>
+                <w:color w:val="444444"/>
+                <w:sz w:val="21"/>
+                <w:szCs w:val="21"/>
+              </w:rPr>
+              <w:t xml:space="preserve">Execution program or phasing: expected full-occupation year per area.</w:t>
             </w:r>
           </w:p>
         </w:tc>
@@ -1537,6 +1565,311 @@
                 <w:szCs w:val="21"/>
               </w:rPr>
               <w:t xml:space="preserve">Licensed premises — number of restaurants, bars and cafés per freguesia.</w:t>
+            </w:r>
+          </w:p>
+        </w:tc>
+      </w:tr>
+      <w:tr>
+        <w:tc>
+          <w:tcPr>
+            <w:tcW w:type="dxa" w:w="560"/>
+            <w:tcMar>
+              <w:top w:type="dxa" w:w="60"/>
+              <w:left w:type="dxa" w:w="100"/>
+              <w:bottom w:type="dxa" w:w="60"/>
+              <w:right w:type="dxa" w:w="100"/>
+            </w:tcMar>
+          </w:tcPr>
+          <w:p>
+            <w:pPr>
+              <w:spacing w:after="80" w:before="0"/>
+            </w:pPr>
+            <w:r>
+              <w:rPr>
+                <w:rFonts w:ascii="Calibri" w:cs="Calibri" w:eastAsia="Calibri" w:hAnsi="Calibri"/>
+                <w:b/>
+                <w:bCs/>
+                <w:color w:val="1a1a1a"/>
+                <w:sz w:val="21"/>
+                <w:szCs w:val="21"/>
+              </w:rPr>
+              <w:t xml:space="preserve">6</w:t>
+            </w:r>
+          </w:p>
+        </w:tc>
+        <w:tc>
+          <w:tcPr>
+            <w:tcW w:type="dxa" w:w="4233"/>
+            <w:tcMar>
+              <w:top w:type="dxa" w:w="60"/>
+              <w:left w:type="dxa" w:w="100"/>
+              <w:bottom w:type="dxa" w:w="60"/>
+              <w:right w:type="dxa" w:w="100"/>
+            </w:tcMar>
+          </w:tcPr>
+          <w:p>
+            <w:pPr>
+              <w:spacing w:after="40" w:before="0"/>
+            </w:pPr>
+            <w:r>
+              <w:rPr>
+                <w:rFonts w:ascii="Calibri" w:cs="Calibri" w:eastAsia="Calibri" w:hAnsi="Calibri"/>
+                <w:b/>
+                <w:bCs/>
+                <w:color w:val="1a1a1a"/>
+                <w:sz w:val="21"/>
+                <w:szCs w:val="21"/>
+              </w:rPr>
+              <w:t xml:space="preserve">Projeções demográficas — estudos municipais de população e crescimento; anexo demográfico da revisão do PDM.</w:t>
+            </w:r>
+          </w:p>
+        </w:tc>
+        <w:tc>
+          <w:tcPr>
+            <w:tcW w:type="dxa" w:w="4233"/>
+            <w:tcMar>
+              <w:top w:type="dxa" w:w="60"/>
+              <w:left w:type="dxa" w:w="100"/>
+              <w:bottom w:type="dxa" w:w="60"/>
+              <w:right w:type="dxa" w:w="100"/>
+            </w:tcMar>
+          </w:tcPr>
+          <w:p>
+            <w:pPr>
+              <w:spacing w:after="40" w:before="0"/>
+            </w:pPr>
+            <w:r>
+              <w:rPr>
+                <w:rFonts w:ascii="Calibri" w:cs="Calibri" w:eastAsia="Calibri" w:hAnsi="Calibri"/>
+                <w:b/>
+                <w:bCs/>
+                <w:color w:val="333333"/>
+                <w:sz w:val="21"/>
+                <w:szCs w:val="21"/>
+              </w:rPr>
+              <w:t xml:space="preserve">Population projections — municipal population and growth studies; demographic annex of the PDM revision.</w:t>
+            </w:r>
+          </w:p>
+        </w:tc>
+      </w:tr>
+      <w:tr>
+        <w:tc>
+          <w:tcPr>
+            <w:tcW w:type="dxa" w:w="560"/>
+            <w:tcMar>
+              <w:top w:type="dxa" w:w="60"/>
+              <w:left w:type="dxa" w:w="100"/>
+              <w:bottom w:type="dxa" w:w="60"/>
+              <w:right w:type="dxa" w:w="100"/>
+            </w:tcMar>
+          </w:tcPr>
+          <w:p>
+            <w:pPr>
+              <w:spacing w:after="80" w:before="0"/>
+            </w:pPr>
+            <w:r>
+              <w:rPr>
+                <w:rFonts w:ascii="Calibri" w:cs="Calibri" w:eastAsia="Calibri" w:hAnsi="Calibri"/>
+                <w:b/>
+                <w:bCs/>
+                <w:color w:val="1a1a1a"/>
+                <w:sz w:val="21"/>
+                <w:szCs w:val="21"/>
+              </w:rPr>
+              <w:t xml:space="preserve">7</w:t>
+            </w:r>
+          </w:p>
+        </w:tc>
+        <w:tc>
+          <w:tcPr>
+            <w:tcW w:type="dxa" w:w="4233"/>
+            <w:tcMar>
+              <w:top w:type="dxa" w:w="60"/>
+              <w:left w:type="dxa" w:w="100"/>
+              <w:bottom w:type="dxa" w:w="60"/>
+              <w:right w:type="dxa" w:w="100"/>
+            </w:tcMar>
+          </w:tcPr>
+          <w:p>
+            <w:pPr>
+              <w:spacing w:after="40" w:before="0"/>
+            </w:pPr>
+            <w:r>
+              <w:rPr>
+                <w:rFonts w:ascii="Calibri" w:cs="Calibri" w:eastAsia="Calibri" w:hAnsi="Calibri"/>
+                <w:b/>
+                <w:bCs/>
+                <w:color w:val="1a1a1a"/>
+                <w:sz w:val="21"/>
+                <w:szCs w:val="21"/>
+              </w:rPr>
+              <w:t xml:space="preserve">Cartografia SIG — planta de ordenamento do PDM em formato SHP; arruamentos; edificado (polígonos); pontos de endereço.</w:t>
+            </w:r>
+          </w:p>
+          <w:p>
+            <w:pPr>
+              <w:spacing w:after="40" w:before="0"/>
+            </w:pPr>
+            <w:r>
+              <w:rPr>
+                <w:rFonts w:ascii="Calibri" w:cs="Calibri" w:eastAsia="Calibri" w:hAnsi="Calibri"/>
+                <w:color w:val="1a1a1a"/>
+                <w:sz w:val="21"/>
+                <w:szCs w:val="21"/>
+              </w:rPr>
+              <w:t xml:space="preserve">DWG apenas onde não exista SHP.</w:t>
+            </w:r>
+          </w:p>
+        </w:tc>
+        <w:tc>
+          <w:tcPr>
+            <w:tcW w:type="dxa" w:w="4233"/>
+            <w:tcMar>
+              <w:top w:type="dxa" w:w="60"/>
+              <w:left w:type="dxa" w:w="100"/>
+              <w:bottom w:type="dxa" w:w="60"/>
+              <w:right w:type="dxa" w:w="100"/>
+            </w:tcMar>
+          </w:tcPr>
+          <w:p>
+            <w:pPr>
+              <w:spacing w:after="40" w:before="0"/>
+            </w:pPr>
+            <w:r>
+              <w:rPr>
+                <w:rFonts w:ascii="Calibri" w:cs="Calibri" w:eastAsia="Calibri" w:hAnsi="Calibri"/>
+                <w:b/>
+                <w:bCs/>
+                <w:color w:val="333333"/>
+                <w:sz w:val="21"/>
+                <w:szCs w:val="21"/>
+              </w:rPr>
+              <w:t xml:space="preserve">GIS files — PDM zoning as SHP; streets; building footprints; address points.</w:t>
+            </w:r>
+          </w:p>
+          <w:p>
+            <w:pPr>
+              <w:spacing w:after="40" w:before="0"/>
+            </w:pPr>
+            <w:r>
+              <w:rPr>
+                <w:rFonts w:ascii="Calibri" w:cs="Calibri" w:eastAsia="Calibri" w:hAnsi="Calibri"/>
+                <w:color w:val="444444"/>
+                <w:sz w:val="21"/>
+                <w:szCs w:val="21"/>
+              </w:rPr>
+              <w:t xml:space="preserve">DWG only where no SHP exists.</w:t>
+            </w:r>
+          </w:p>
+        </w:tc>
+      </w:tr>
+      <w:tr>
+        <w:tc>
+          <w:tcPr>
+            <w:tcW w:type="dxa" w:w="560"/>
+            <w:tcMar>
+              <w:top w:type="dxa" w:w="60"/>
+              <w:left w:type="dxa" w:w="100"/>
+              <w:bottom w:type="dxa" w:w="60"/>
+              <w:right w:type="dxa" w:w="100"/>
+            </w:tcMar>
+          </w:tcPr>
+          <w:p>
+            <w:pPr>
+              <w:spacing w:after="80" w:before="0"/>
+            </w:pPr>
+            <w:r>
+              <w:rPr>
+                <w:rFonts w:ascii="Calibri" w:cs="Calibri" w:eastAsia="Calibri" w:hAnsi="Calibri"/>
+                <w:b/>
+                <w:bCs/>
+                <w:color w:val="1a1a1a"/>
+                <w:sz w:val="21"/>
+                <w:szCs w:val="21"/>
+              </w:rPr>
+              <w:t xml:space="preserve">8</w:t>
+            </w:r>
+          </w:p>
+        </w:tc>
+        <w:tc>
+          <w:tcPr>
+            <w:tcW w:type="dxa" w:w="4233"/>
+            <w:tcMar>
+              <w:top w:type="dxa" w:w="60"/>
+              <w:left w:type="dxa" w:w="100"/>
+              <w:bottom w:type="dxa" w:w="60"/>
+              <w:right w:type="dxa" w:w="100"/>
+            </w:tcMar>
+          </w:tcPr>
+          <w:p>
+            <w:pPr>
+              <w:spacing w:after="40" w:before="0"/>
+            </w:pPr>
+            <w:r>
+              <w:rPr>
+                <w:rFonts w:ascii="Calibri" w:cs="Calibri" w:eastAsia="Calibri" w:hAnsi="Calibri"/>
+                <w:b/>
+                <w:bCs/>
+                <w:color w:val="1a1a1a"/>
+                <w:sz w:val="21"/>
+                <w:szCs w:val="21"/>
+              </w:rPr>
+              <w:t xml:space="preserve">Fogos por edifício — número de fogos ou frações por edifício ou lote (cadastro urbano).</w:t>
+            </w:r>
+          </w:p>
+          <w:p>
+            <w:pPr>
+              <w:spacing w:after="40" w:before="0"/>
+            </w:pPr>
+            <w:r>
+              <w:rPr>
+                <w:rFonts w:ascii="Calibri" w:cs="Calibri" w:eastAsia="Calibri" w:hAnsi="Calibri"/>
+                <w:color w:val="1a1a1a"/>
+                <w:sz w:val="21"/>
+                <w:szCs w:val="21"/>
+              </w:rPr>
+              <w:t xml:space="preserve">Em alternativa: ligações de água por rua.</w:t>
+            </w:r>
+          </w:p>
+        </w:tc>
+        <w:tc>
+          <w:tcPr>
+            <w:tcW w:type="dxa" w:w="4233"/>
+            <w:tcMar>
+              <w:top w:type="dxa" w:w="60"/>
+              <w:left w:type="dxa" w:w="100"/>
+              <w:bottom w:type="dxa" w:w="60"/>
+              <w:right w:type="dxa" w:w="100"/>
+            </w:tcMar>
+          </w:tcPr>
+          <w:p>
+            <w:pPr>
+              <w:spacing w:after="40" w:before="0"/>
+            </w:pPr>
+            <w:r>
+              <w:rPr>
+                <w:rFonts w:ascii="Calibri" w:cs="Calibri" w:eastAsia="Calibri" w:hAnsi="Calibri"/>
+                <w:b/>
+                <w:bCs/>
+                <w:color w:val="333333"/>
+                <w:sz w:val="21"/>
+                <w:szCs w:val="21"/>
+              </w:rPr>
+              <w:t xml:space="preserve">Dwellings per building — dwelling or unit counts per building or parcel (urban cadastre).</w:t>
+            </w:r>
+          </w:p>
+          <w:p>
+            <w:pPr>
+              <w:spacing w:after="40" w:before="0"/>
+            </w:pPr>
+            <w:r>
+              <w:rPr>
+                <w:rFonts w:ascii="Calibri" w:cs="Calibri" w:eastAsia="Calibri" w:hAnsi="Calibri"/>
+                <w:color w:val="444444"/>
+                <w:sz w:val="21"/>
+                <w:szCs w:val="21"/>
+              </w:rPr>
+              <w:t xml:space="preserve">Alternative: water-service connections per street.</w:t>
             </w:r>
           </w:p>
         </w:tc>

</xml_diff>